<commit_message>
docs: update SEB documentation and index links
Update the SafeExamBrowser (SEB) documentation files and index.html to reflect the new URL structure and platform availability.

- Update SEB guide links from `s.id/olympiad2026` to `s.id/olympiad-2026` in .docx and .pdf files
- Update the SEB protocol link in `index.html` from netlify to vercel
- Update text in `index.html` to include Mac OS and iOS support for exam links
- Update footer to include "IM" in the credits
</commit_message>
<xml_diff>
--- a/Panduan_SafeExamBrowser_Windows_Mac_iOS.docx
+++ b/Panduan_SafeExamBrowser_Windows_Mac_iOS.docx
@@ -23,12 +23,6 @@
         <w:gridCol w:w="9026"/>
       </w:tblGrid>
       <w:tr>
-        <w:tblPrEx>
-          <w:tblCellMar>
-            <w:top w:w="0" w:type="dxa"/>
-            <w:bottom w:w="0" w:type="dxa"/>
-          </w:tblCellMar>
-        </w:tblPrEx>
         <w:tc>
           <w:tcPr>
             <w:tcW w:w="9026" w:type="dxa"/>
@@ -198,12 +192,6 @@
         <w:gridCol w:w="6026"/>
       </w:tblGrid>
       <w:tr>
-        <w:tblPrEx>
-          <w:tblCellMar>
-            <w:top w:w="0" w:type="dxa"/>
-            <w:bottom w:w="0" w:type="dxa"/>
-          </w:tblCellMar>
-        </w:tblPrEx>
         <w:tc>
           <w:tcPr>
             <w:tcW w:w="3000" w:type="dxa"/>
@@ -268,12 +256,6 @@
         </w:tc>
       </w:tr>
       <w:tr>
-        <w:tblPrEx>
-          <w:tblCellMar>
-            <w:top w:w="0" w:type="dxa"/>
-            <w:bottom w:w="0" w:type="dxa"/>
-          </w:tblCellMar>
-        </w:tblPrEx>
         <w:tc>
           <w:tcPr>
             <w:tcW w:w="3000" w:type="dxa"/>
@@ -331,12 +313,6 @@
         </w:tc>
       </w:tr>
       <w:tr>
-        <w:tblPrEx>
-          <w:tblCellMar>
-            <w:top w:w="0" w:type="dxa"/>
-            <w:bottom w:w="0" w:type="dxa"/>
-          </w:tblCellMar>
-        </w:tblPrEx>
         <w:tc>
           <w:tcPr>
             <w:tcW w:w="3000" w:type="dxa"/>
@@ -389,12 +365,6 @@
         </w:tc>
       </w:tr>
       <w:tr>
-        <w:tblPrEx>
-          <w:tblCellMar>
-            <w:top w:w="0" w:type="dxa"/>
-            <w:bottom w:w="0" w:type="dxa"/>
-          </w:tblCellMar>
-        </w:tblPrEx>
         <w:tc>
           <w:tcPr>
             <w:tcW w:w="3000" w:type="dxa"/>
@@ -455,12 +425,6 @@
         </w:tc>
       </w:tr>
       <w:tr>
-        <w:tblPrEx>
-          <w:tblCellMar>
-            <w:top w:w="0" w:type="dxa"/>
-            <w:bottom w:w="0" w:type="dxa"/>
-          </w:tblCellMar>
-        </w:tblPrEx>
         <w:tc>
           <w:tcPr>
             <w:tcW w:w="3000" w:type="dxa"/>
@@ -529,12 +493,6 @@
         </w:tc>
       </w:tr>
       <w:tr>
-        <w:tblPrEx>
-          <w:tblCellMar>
-            <w:top w:w="0" w:type="dxa"/>
-            <w:bottom w:w="0" w:type="dxa"/>
-          </w:tblCellMar>
-        </w:tblPrEx>
         <w:tc>
           <w:tcPr>
             <w:tcW w:w="3000" w:type="dxa"/>
@@ -587,12 +545,6 @@
         </w:tc>
       </w:tr>
       <w:tr>
-        <w:tblPrEx>
-          <w:tblCellMar>
-            <w:top w:w="0" w:type="dxa"/>
-            <w:bottom w:w="0" w:type="dxa"/>
-          </w:tblCellMar>
-        </w:tblPrEx>
         <w:tc>
           <w:tcPr>
             <w:tcW w:w="3000" w:type="dxa"/>
@@ -661,12 +613,6 @@
         </w:tc>
       </w:tr>
       <w:tr>
-        <w:tblPrEx>
-          <w:tblCellMar>
-            <w:top w:w="0" w:type="dxa"/>
-            <w:bottom w:w="0" w:type="dxa"/>
-          </w:tblCellMar>
-        </w:tblPrEx>
         <w:tc>
           <w:tcPr>
             <w:tcW w:w="3000" w:type="dxa"/>
@@ -785,12 +731,6 @@
         <w:gridCol w:w="913"/>
       </w:tblGrid>
       <w:tr>
-        <w:tblPrEx>
-          <w:tblCellMar>
-            <w:top w:w="0" w:type="dxa"/>
-            <w:bottom w:w="0" w:type="dxa"/>
-          </w:tblCellMar>
-        </w:tblPrEx>
         <w:tc>
           <w:tcPr>
             <w:tcW w:w="500" w:type="dxa"/>
@@ -917,12 +857,6 @@
         </w:tc>
       </w:tr>
       <w:tr>
-        <w:tblPrEx>
-          <w:tblCellMar>
-            <w:top w:w="0" w:type="dxa"/>
-            <w:bottom w:w="0" w:type="dxa"/>
-          </w:tblCellMar>
-        </w:tblPrEx>
         <w:tc>
           <w:tcPr>
             <w:tcW w:w="500" w:type="dxa"/>
@@ -1041,28 +975,12 @@
                 <w:sz w:val="20"/>
                 <w:szCs w:val="20"/>
               </w:rPr>
-              <w:t>✅</w:t>
-            </w:r>
-            <w:r>
-              <w:rPr>
-                <w:b/>
-                <w:bCs/>
-                <w:color w:val="276221"/>
-                <w:sz w:val="20"/>
-                <w:szCs w:val="20"/>
-              </w:rPr>
-              <w:t xml:space="preserve"> Utama</w:t>
+              <w:t>✅ Utama</w:t>
             </w:r>
           </w:p>
         </w:tc>
       </w:tr>
       <w:tr>
-        <w:tblPrEx>
-          <w:tblCellMar>
-            <w:top w:w="0" w:type="dxa"/>
-            <w:bottom w:w="0" w:type="dxa"/>
-          </w:tblCellMar>
-        </w:tblPrEx>
         <w:tc>
           <w:tcPr>
             <w:tcW w:w="500" w:type="dxa"/>
@@ -1144,13 +1062,23 @@
           </w:tcPr>
           <w:p>
             <w:hyperlink r:id="rId7" w:history="1">
+              <w:r>
+                <w:rPr>
+                  <w:rStyle w:val="Hyperlink"/>
+                  <w:b/>
+                  <w:bCs/>
+                  <w:sz w:val="20"/>
+                  <w:szCs w:val="20"/>
+                </w:rPr>
+                <w:t>GitHub</w:t>
+              </w:r>
               <w:r>
                 <w:rPr>
                   <w:rStyle w:val="Hyperlink"/>
                   <w:sz w:val="20"/>
                   <w:szCs w:val="20"/>
                 </w:rPr>
-                <w:t>GitHub ( https://github.com/SafeExamBrowser/seb-win-refactoring/releases/download/v3.10.1/SEB_3.10.1.864_SetupBundle.exe )</w:t>
+                <w:t xml:space="preserve"> ( https://github.com/SafeExamBrowser/seb-win-refactoring/releases/download/v3.10.1/SEB_3.10.1.864_SetupBundle.exe )</w:t>
               </w:r>
             </w:hyperlink>
           </w:p>
@@ -1185,8 +1113,9 @@
                 <w:sz w:val="20"/>
                 <w:szCs w:val="20"/>
               </w:rPr>
-              <w:t>✅</w:t>
-            </w:r>
+              <w:t xml:space="preserve">✅ </w:t>
+            </w:r>
+            <w:proofErr w:type="spellStart"/>
             <w:r>
               <w:rPr>
                 <w:b/>
@@ -1195,17 +1124,6 @@
                 <w:sz w:val="20"/>
                 <w:szCs w:val="20"/>
               </w:rPr>
-              <w:t xml:space="preserve"> </w:t>
-            </w:r>
-            <w:proofErr w:type="spellStart"/>
-            <w:r>
-              <w:rPr>
-                <w:b/>
-                <w:bCs/>
-                <w:color w:val="276221"/>
-                <w:sz w:val="20"/>
-                <w:szCs w:val="20"/>
-              </w:rPr>
               <w:t>Backup</w:t>
             </w:r>
             <w:proofErr w:type="spellEnd"/>
@@ -1213,12 +1131,6 @@
         </w:tc>
       </w:tr>
       <w:tr>
-        <w:tblPrEx>
-          <w:tblCellMar>
-            <w:top w:w="0" w:type="dxa"/>
-            <w:bottom w:w="0" w:type="dxa"/>
-          </w:tblCellMar>
-        </w:tblPrEx>
         <w:tc>
           <w:tcPr>
             <w:tcW w:w="500" w:type="dxa"/>
@@ -1298,13 +1210,23 @@
           </w:tcPr>
           <w:p>
             <w:hyperlink r:id="rId8" w:history="1">
+              <w:r>
+                <w:rPr>
+                  <w:rStyle w:val="Hyperlink"/>
+                  <w:b/>
+                  <w:bCs/>
+                  <w:sz w:val="20"/>
+                  <w:szCs w:val="20"/>
+                </w:rPr>
+                <w:t>Archive.org</w:t>
+              </w:r>
               <w:r>
                 <w:rPr>
                   <w:rStyle w:val="Hyperlink"/>
                   <w:sz w:val="20"/>
                   <w:szCs w:val="20"/>
                 </w:rPr>
-                <w:t>Archive.org ( https://archive.org/download/seb-3.10.1.864-setup-bundle/SEB_3.10.1.864_SetupBundle.exe )</w:t>
+                <w:t xml:space="preserve"> ( https://archive.org/download/seb-3.10.1.864-setup-bundle/SEB_3.10.1.864_SetupBundle.exe )</w:t>
               </w:r>
             </w:hyperlink>
           </w:p>
@@ -1339,8 +1261,9 @@
                 <w:sz w:val="20"/>
                 <w:szCs w:val="20"/>
               </w:rPr>
-              <w:t>✅</w:t>
-            </w:r>
+              <w:t xml:space="preserve">✅ </w:t>
+            </w:r>
+            <w:proofErr w:type="spellStart"/>
             <w:r>
               <w:rPr>
                 <w:b/>
@@ -1349,17 +1272,6 @@
                 <w:sz w:val="20"/>
                 <w:szCs w:val="20"/>
               </w:rPr>
-              <w:t xml:space="preserve"> </w:t>
-            </w:r>
-            <w:proofErr w:type="spellStart"/>
-            <w:r>
-              <w:rPr>
-                <w:b/>
-                <w:bCs/>
-                <w:color w:val="276221"/>
-                <w:sz w:val="20"/>
-                <w:szCs w:val="20"/>
-              </w:rPr>
               <w:t>Backup</w:t>
             </w:r>
             <w:proofErr w:type="spellEnd"/>
@@ -1367,12 +1279,6 @@
         </w:tc>
       </w:tr>
       <w:tr>
-        <w:tblPrEx>
-          <w:tblCellMar>
-            <w:top w:w="0" w:type="dxa"/>
-            <w:bottom w:w="0" w:type="dxa"/>
-          </w:tblCellMar>
-        </w:tblPrEx>
         <w:tc>
           <w:tcPr>
             <w:tcW w:w="500" w:type="dxa"/>
@@ -1461,13 +1367,23 @@
           </w:tcPr>
           <w:p>
             <w:hyperlink r:id="rId9" w:history="1">
+              <w:r>
+                <w:rPr>
+                  <w:rStyle w:val="Hyperlink"/>
+                  <w:b/>
+                  <w:bCs/>
+                  <w:sz w:val="20"/>
+                  <w:szCs w:val="20"/>
+                </w:rPr>
+                <w:t>Drive</w:t>
+              </w:r>
               <w:r>
                 <w:rPr>
                   <w:rStyle w:val="Hyperlink"/>
                   <w:sz w:val="20"/>
                   <w:szCs w:val="20"/>
                 </w:rPr>
-                <w:t>Drive ( https://drive.google.com/file/d/1VpafnkP-WyPL46iaOeoVj6cv-NxzqUFD/view?usp=drive_link )</w:t>
+                <w:t xml:space="preserve"> ( https://drive.google.com/file/d/1VpafnkP-WyPL46iaOeoVj6cv-NxzqUFD/view?usp=drive_link )</w:t>
               </w:r>
             </w:hyperlink>
             <w:r>
@@ -1510,17 +1426,7 @@
                 <w:sz w:val="20"/>
                 <w:szCs w:val="20"/>
               </w:rPr>
-              <w:t>✅</w:t>
-            </w:r>
-            <w:r>
-              <w:rPr>
-                <w:b/>
-                <w:bCs/>
-                <w:color w:val="276221"/>
-                <w:sz w:val="20"/>
-                <w:szCs w:val="20"/>
-              </w:rPr>
-              <w:t xml:space="preserve"> </w:t>
+              <w:t xml:space="preserve">✅ </w:t>
             </w:r>
             <w:proofErr w:type="spellStart"/>
             <w:r>
@@ -1583,12 +1489,6 @@
         <w:gridCol w:w="1300"/>
       </w:tblGrid>
       <w:tr>
-        <w:tblPrEx>
-          <w:tblCellMar>
-            <w:top w:w="0" w:type="dxa"/>
-            <w:bottom w:w="0" w:type="dxa"/>
-          </w:tblCellMar>
-        </w:tblPrEx>
         <w:tc>
           <w:tcPr>
             <w:tcW w:w="500" w:type="dxa"/>
@@ -1715,12 +1615,6 @@
         </w:tc>
       </w:tr>
       <w:tr>
-        <w:tblPrEx>
-          <w:tblCellMar>
-            <w:top w:w="0" w:type="dxa"/>
-            <w:bottom w:w="0" w:type="dxa"/>
-          </w:tblCellMar>
-        </w:tblPrEx>
         <w:tc>
           <w:tcPr>
             <w:tcW w:w="500" w:type="dxa"/>
@@ -1875,28 +1769,12 @@
                 <w:sz w:val="20"/>
                 <w:szCs w:val="20"/>
               </w:rPr>
-              <w:t>✅</w:t>
-            </w:r>
-            <w:r>
-              <w:rPr>
-                <w:b/>
-                <w:bCs/>
-                <w:color w:val="276221"/>
-                <w:sz w:val="20"/>
-                <w:szCs w:val="20"/>
-              </w:rPr>
-              <w:t xml:space="preserve"> Utama</w:t>
+              <w:t>✅ Utama</w:t>
             </w:r>
           </w:p>
         </w:tc>
       </w:tr>
       <w:tr>
-        <w:tblPrEx>
-          <w:tblCellMar>
-            <w:top w:w="0" w:type="dxa"/>
-            <w:bottom w:w="0" w:type="dxa"/>
-          </w:tblCellMar>
-        </w:tblPrEx>
         <w:trPr>
           <w:trHeight w:val="915"/>
         </w:trPr>
@@ -1985,10 +1863,12 @@
               <w:r>
                 <w:rPr>
                   <w:rStyle w:val="Hyperlink"/>
+                  <w:b/>
+                  <w:bCs/>
                   <w:sz w:val="20"/>
                   <w:szCs w:val="20"/>
                 </w:rPr>
-                <w:t xml:space="preserve">GitHub ( </w:t>
+                <w:t>GitHub</w:t>
               </w:r>
               <w:r>
                 <w:rPr>
@@ -1996,15 +1876,7 @@
                   <w:sz w:val="20"/>
                   <w:szCs w:val="20"/>
                 </w:rPr>
-                <w:t>https://github.com/SafeExamBrowser/seb-mac/releases/download/3.6.1/SafeExamBrowser-3.6.1.dmg</w:t>
-              </w:r>
-              <w:r>
-                <w:rPr>
-                  <w:rStyle w:val="Hyperlink"/>
-                  <w:sz w:val="20"/>
-                  <w:szCs w:val="20"/>
-                </w:rPr>
-                <w:t xml:space="preserve"> )</w:t>
+                <w:t xml:space="preserve"> ( https://github.com/SafeExamBrowser/seb-mac/releases/download/3.6.1/SafeExamBrowser-3.6.1.dmg )</w:t>
               </w:r>
             </w:hyperlink>
           </w:p>
@@ -2039,17 +1911,7 @@
                 <w:sz w:val="20"/>
                 <w:szCs w:val="20"/>
               </w:rPr>
-              <w:t>✅</w:t>
-            </w:r>
-            <w:r>
-              <w:rPr>
-                <w:b/>
-                <w:bCs/>
-                <w:color w:val="276221"/>
-                <w:sz w:val="20"/>
-                <w:szCs w:val="20"/>
-              </w:rPr>
-              <w:t xml:space="preserve"> </w:t>
+              <w:t xml:space="preserve">✅ </w:t>
             </w:r>
             <w:proofErr w:type="spellStart"/>
             <w:r>
@@ -2112,12 +1974,6 @@
         <w:gridCol w:w="1165"/>
       </w:tblGrid>
       <w:tr>
-        <w:tblPrEx>
-          <w:tblCellMar>
-            <w:top w:w="0" w:type="dxa"/>
-            <w:bottom w:w="0" w:type="dxa"/>
-          </w:tblCellMar>
-        </w:tblPrEx>
         <w:tc>
           <w:tcPr>
             <w:tcW w:w="500" w:type="dxa"/>
@@ -2244,12 +2100,6 @@
         </w:tc>
       </w:tr>
       <w:tr>
-        <w:tblPrEx>
-          <w:tblCellMar>
-            <w:top w:w="0" w:type="dxa"/>
-            <w:bottom w:w="0" w:type="dxa"/>
-          </w:tblCellMar>
-        </w:tblPrEx>
         <w:tc>
           <w:tcPr>
             <w:tcW w:w="500" w:type="dxa"/>
@@ -2345,23 +2195,15 @@
           </w:tcPr>
           <w:p>
             <w:hyperlink r:id="rId12" w:history="1">
-              <w:proofErr w:type="spellStart"/>
               <w:r>
                 <w:rPr>
                   <w:rStyle w:val="Hyperlink"/>
+                  <w:b/>
+                  <w:bCs/>
                   <w:sz w:val="20"/>
                   <w:szCs w:val="20"/>
                 </w:rPr>
-                <w:t>SafeExamBrowser</w:t>
-              </w:r>
-              <w:proofErr w:type="spellEnd"/>
-              <w:r>
-                <w:rPr>
-                  <w:rStyle w:val="Hyperlink"/>
-                  <w:sz w:val="20"/>
-                  <w:szCs w:val="20"/>
-                </w:rPr>
-                <w:t xml:space="preserve"> di App Store</w:t>
+                <w:t>SafeExamBrowser di App Store</w:t>
               </w:r>
             </w:hyperlink>
             <w:r>
@@ -2422,17 +2264,7 @@
                 <w:sz w:val="20"/>
                 <w:szCs w:val="20"/>
               </w:rPr>
-              <w:t>✅</w:t>
-            </w:r>
-            <w:r>
-              <w:rPr>
-                <w:b/>
-                <w:bCs/>
-                <w:color w:val="276221"/>
-                <w:sz w:val="20"/>
-                <w:szCs w:val="20"/>
-              </w:rPr>
-              <w:t xml:space="preserve"> Tersedia</w:t>
+              <w:t>✅ Tersedia</w:t>
             </w:r>
           </w:p>
         </w:tc>
@@ -2465,12 +2297,6 @@
         <w:gridCol w:w="9026"/>
       </w:tblGrid>
       <w:tr>
-        <w:tblPrEx>
-          <w:tblCellMar>
-            <w:top w:w="0" w:type="dxa"/>
-            <w:bottom w:w="0" w:type="dxa"/>
-          </w:tblCellMar>
-        </w:tblPrEx>
         <w:tc>
           <w:tcPr>
             <w:tcW w:w="9026" w:type="dxa"/>
@@ -2495,23 +2321,7 @@
                 <w:bCs/>
                 <w:color w:val="1F4E79"/>
               </w:rPr>
-              <w:t>ℹ</w:t>
-            </w:r>
-            <w:r>
-              <w:rPr>
-                <w:b/>
-                <w:bCs/>
-                <w:color w:val="1F4E79"/>
-              </w:rPr>
-              <w:t>️</w:t>
-            </w:r>
-            <w:r>
-              <w:rPr>
-                <w:b/>
-                <w:bCs/>
-                <w:color w:val="1F4E79"/>
-              </w:rPr>
-              <w:t xml:space="preserve">  Link Konfigurasi (</w:t>
+              <w:t>ℹ️  Link Konfigurasi (</w:t>
             </w:r>
             <w:proofErr w:type="spellStart"/>
             <w:r>
@@ -2546,15 +2356,7 @@
                   <w:b/>
                   <w:bCs/>
                 </w:rPr>
-                <w:t>https://</w:t>
-              </w:r>
-              <w:r>
-                <w:rPr>
-                  <w:rStyle w:val="Hyperlink"/>
-                  <w:b/>
-                  <w:bCs/>
-                </w:rPr>
-                <w:t>s.id/olympiad2026</w:t>
+                <w:t>https://s.id/olympiad-2026</w:t>
               </w:r>
             </w:hyperlink>
             <w:r>
@@ -2648,12 +2450,6 @@
         <w:gridCol w:w="9026"/>
       </w:tblGrid>
       <w:tr>
-        <w:tblPrEx>
-          <w:tblCellMar>
-            <w:top w:w="0" w:type="dxa"/>
-            <w:bottom w:w="0" w:type="dxa"/>
-          </w:tblCellMar>
-        </w:tblPrEx>
         <w:tc>
           <w:tcPr>
             <w:tcW w:w="9026" w:type="dxa"/>
@@ -2678,23 +2474,7 @@
                 <w:bCs/>
                 <w:color w:val="7D4E00"/>
               </w:rPr>
-              <w:t>⚠</w:t>
-            </w:r>
-            <w:r>
-              <w:rPr>
-                <w:b/>
-                <w:bCs/>
-                <w:color w:val="7D4E00"/>
-              </w:rPr>
-              <w:t>️</w:t>
-            </w:r>
-            <w:r>
-              <w:rPr>
-                <w:b/>
-                <w:bCs/>
-                <w:color w:val="7D4E00"/>
-              </w:rPr>
-              <w:t xml:space="preserve">  Perhatian: </w:t>
+              <w:t xml:space="preserve">⚠️  Perhatian: </w:t>
             </w:r>
             <w:r>
               <w:t xml:space="preserve">Pastikan komputer/laptop menggunakan Windows 10 atau Windows 11. </w:t>
@@ -2929,10 +2709,7 @@
       </w:r>
       <w:proofErr w:type="spellEnd"/>
       <w:r>
-        <w:t xml:space="preserve"> SE</w:t>
-      </w:r>
-      <w:r>
-        <w:t>B_3.10.1.864_SetupBundle.exe.</w:t>
+        <w:t xml:space="preserve"> SEB_3.10.1.864_SetupBundle.exe.</w:t>
       </w:r>
     </w:p>
     <w:p>
@@ -3000,10 +2777,7 @@
       </w:r>
       <w:proofErr w:type="spellEnd"/>
       <w:r>
-        <w:t xml:space="preserve"> untuk memulai pro</w:t>
-      </w:r>
-      <w:r>
-        <w:t>ses instalasi.</w:t>
+        <w:t xml:space="preserve"> untuk memulai proses instalasi.</w:t>
       </w:r>
     </w:p>
     <w:p>
@@ -3053,12 +2827,6 @@
         <w:gridCol w:w="9026"/>
       </w:tblGrid>
       <w:tr>
-        <w:tblPrEx>
-          <w:tblCellMar>
-            <w:top w:w="0" w:type="dxa"/>
-            <w:bottom w:w="0" w:type="dxa"/>
-          </w:tblCellMar>
-        </w:tblPrEx>
         <w:tc>
           <w:tcPr>
             <w:tcW w:w="9026" w:type="dxa"/>
@@ -3083,15 +2851,7 @@
                 <w:bCs/>
                 <w:color w:val="276221"/>
               </w:rPr>
-              <w:t>✅</w:t>
-            </w:r>
-            <w:r>
-              <w:rPr>
-                <w:b/>
-                <w:bCs/>
-                <w:color w:val="276221"/>
-              </w:rPr>
-              <w:t xml:space="preserve">  Berhasil: </w:t>
+              <w:t xml:space="preserve">✅  Berhasil: </w:t>
             </w:r>
             <w:proofErr w:type="spellStart"/>
             <w:r>
@@ -3165,7 +2925,19 @@
           <w:rPr>
             <w:rStyle w:val="Hyperlink"/>
           </w:rPr>
-          <w:t xml:space="preserve">s.id/olympiad2026 atau </w:t>
+          <w:t>s.id/olympiad</w:t>
+        </w:r>
+        <w:r>
+          <w:rPr>
+            <w:rStyle w:val="Hyperlink"/>
+          </w:rPr>
+          <w:t>-</w:t>
+        </w:r>
+        <w:r>
+          <w:rPr>
+            <w:rStyle w:val="Hyperlink"/>
+          </w:rPr>
+          <w:t xml:space="preserve">2026 atau </w:t>
         </w:r>
         <w:r>
           <w:rPr>
@@ -3276,17 +3048,11 @@
       </w:r>
       <w:proofErr w:type="spellEnd"/>
       <w:r>
-        <w:t xml:space="preserve">. SEB akan </w:t>
-      </w:r>
-      <w:r>
-        <w:t xml:space="preserve">membuka halaman ujian secara otomatis dalam mode </w:t>
+        <w:t xml:space="preserve">. SEB akan membuka halaman ujian secara otomatis dalam mode </w:t>
       </w:r>
       <w:proofErr w:type="spellStart"/>
       <w:r>
-        <w:t>kio</w:t>
-      </w:r>
-      <w:r>
-        <w:t>sk</w:t>
+        <w:t>kiosk</w:t>
       </w:r>
       <w:proofErr w:type="spellEnd"/>
       <w:r>
@@ -3319,12 +3085,6 @@
         <w:gridCol w:w="9026"/>
       </w:tblGrid>
       <w:tr>
-        <w:tblPrEx>
-          <w:tblCellMar>
-            <w:top w:w="0" w:type="dxa"/>
-            <w:bottom w:w="0" w:type="dxa"/>
-          </w:tblCellMar>
-        </w:tblPrEx>
         <w:tc>
           <w:tcPr>
             <w:tcW w:w="9026" w:type="dxa"/>
@@ -3349,23 +3109,7 @@
                 <w:bCs/>
                 <w:color w:val="1F4E79"/>
               </w:rPr>
-              <w:t>ℹ</w:t>
-            </w:r>
-            <w:r>
-              <w:rPr>
-                <w:b/>
-                <w:bCs/>
-                <w:color w:val="1F4E79"/>
-              </w:rPr>
-              <w:t>️</w:t>
-            </w:r>
-            <w:r>
-              <w:rPr>
-                <w:b/>
-                <w:bCs/>
-                <w:color w:val="1F4E79"/>
-              </w:rPr>
-              <w:t xml:space="preserve">  Alternatif: </w:t>
+              <w:t xml:space="preserve">ℹ️  Alternatif: </w:t>
             </w:r>
             <w:r>
               <w:t xml:space="preserve">Jika panitia menyediakan </w:t>
@@ -3456,12 +3200,6 @@
         <w:gridCol w:w="9026"/>
       </w:tblGrid>
       <w:tr>
-        <w:tblPrEx>
-          <w:tblCellMar>
-            <w:top w:w="0" w:type="dxa"/>
-            <w:bottom w:w="0" w:type="dxa"/>
-          </w:tblCellMar>
-        </w:tblPrEx>
         <w:tc>
           <w:tcPr>
             <w:tcW w:w="9026" w:type="dxa"/>
@@ -3486,23 +3224,7 @@
                 <w:bCs/>
                 <w:color w:val="7D4E00"/>
               </w:rPr>
-              <w:t>⚠</w:t>
-            </w:r>
-            <w:r>
-              <w:rPr>
-                <w:b/>
-                <w:bCs/>
-                <w:color w:val="7D4E00"/>
-              </w:rPr>
-              <w:t>️</w:t>
-            </w:r>
-            <w:r>
-              <w:rPr>
-                <w:b/>
-                <w:bCs/>
-                <w:color w:val="7D4E00"/>
-              </w:rPr>
-              <w:t xml:space="preserve">  Persyaratan: </w:t>
+              <w:t xml:space="preserve">⚠️  Persyaratan: </w:t>
             </w:r>
             <w:proofErr w:type="spellStart"/>
             <w:r>
@@ -3689,10 +3411,7 @@
       </w:r>
       <w:proofErr w:type="spellEnd"/>
       <w:r>
-        <w:t xml:space="preserve"> SafeExamBrowser-3.6.1.dmg</w:t>
-      </w:r>
-      <w:r>
-        <w:t xml:space="preserve"> untuk membukanya.</w:t>
+        <w:t xml:space="preserve"> SafeExamBrowser-3.6.1.dmg untuk membukanya.</w:t>
       </w:r>
     </w:p>
     <w:p>
@@ -3779,10 +3498,7 @@
       </w:r>
       <w:proofErr w:type="spellEnd"/>
       <w:r>
-        <w:t xml:space="preserve"> untuk pertama kali</w:t>
-      </w:r>
-      <w:r>
-        <w:t>.</w:t>
+        <w:t xml:space="preserve"> untuk pertama kali.</w:t>
       </w:r>
     </w:p>
     <w:p>
@@ -3895,12 +3611,6 @@
         <w:gridCol w:w="9026"/>
       </w:tblGrid>
       <w:tr>
-        <w:tblPrEx>
-          <w:tblCellMar>
-            <w:top w:w="0" w:type="dxa"/>
-            <w:bottom w:w="0" w:type="dxa"/>
-          </w:tblCellMar>
-        </w:tblPrEx>
         <w:tc>
           <w:tcPr>
             <w:tcW w:w="9026" w:type="dxa"/>
@@ -3925,15 +3635,7 @@
                 <w:bCs/>
                 <w:color w:val="276221"/>
               </w:rPr>
-              <w:t>✅</w:t>
-            </w:r>
-            <w:r>
-              <w:rPr>
-                <w:b/>
-                <w:bCs/>
-                <w:color w:val="276221"/>
-              </w:rPr>
-              <w:t xml:space="preserve">  Berhasil: </w:t>
+              <w:t xml:space="preserve">✅  Berhasil: </w:t>
             </w:r>
             <w:proofErr w:type="spellStart"/>
             <w:r>
@@ -3984,10 +3686,7 @@
       </w:r>
       <w:proofErr w:type="spellEnd"/>
       <w:r>
-        <w:t xml:space="preserve"> di iPhone /</w:t>
-      </w:r>
-      <w:r>
-        <w:t xml:space="preserve"> </w:t>
+        <w:t xml:space="preserve"> di iPhone / </w:t>
       </w:r>
       <w:proofErr w:type="spellStart"/>
       <w:r>
@@ -4024,12 +3723,6 @@
         <w:gridCol w:w="9026"/>
       </w:tblGrid>
       <w:tr>
-        <w:tblPrEx>
-          <w:tblCellMar>
-            <w:top w:w="0" w:type="dxa"/>
-            <w:bottom w:w="0" w:type="dxa"/>
-          </w:tblCellMar>
-        </w:tblPrEx>
         <w:tc>
           <w:tcPr>
             <w:tcW w:w="9026" w:type="dxa"/>
@@ -4054,23 +3747,7 @@
                 <w:bCs/>
                 <w:color w:val="7D4E00"/>
               </w:rPr>
-              <w:t>⚠</w:t>
-            </w:r>
-            <w:r>
-              <w:rPr>
-                <w:b/>
-                <w:bCs/>
-                <w:color w:val="7D4E00"/>
-              </w:rPr>
-              <w:t>️</w:t>
-            </w:r>
-            <w:r>
-              <w:rPr>
-                <w:b/>
-                <w:bCs/>
-                <w:color w:val="7D4E00"/>
-              </w:rPr>
-              <w:t xml:space="preserve">  Persyaratan: </w:t>
+              <w:t xml:space="preserve">⚠️  Persyaratan: </w:t>
             </w:r>
             <w:r>
               <w:t xml:space="preserve">iPhone atau </w:t>
@@ -4256,10 +3933,7 @@
         <w:spacing w:before="40" w:after="40"/>
       </w:pPr>
       <w:r>
-        <w:t>Tunggu unduha</w:t>
-      </w:r>
-      <w:r>
-        <w:t>n dan instalasi selesai.</w:t>
+        <w:t>Tunggu unduhan dan instalasi selesai.</w:t>
       </w:r>
       <w:r>
         <w:br/>
@@ -4348,7 +4022,19 @@
           <w:rPr>
             <w:rStyle w:val="Hyperlink"/>
           </w:rPr>
-          <w:t xml:space="preserve">s.id/olympiad2026 atau </w:t>
+          <w:t>s.id/olympiad</w:t>
+        </w:r>
+        <w:r>
+          <w:rPr>
+            <w:rStyle w:val="Hyperlink"/>
+          </w:rPr>
+          <w:t>-</w:t>
+        </w:r>
+        <w:r>
+          <w:rPr>
+            <w:rStyle w:val="Hyperlink"/>
+          </w:rPr>
+          <w:t xml:space="preserve">2026 atau </w:t>
         </w:r>
         <w:r>
           <w:rPr>
@@ -4487,10 +4173,7 @@
         <w:pStyle w:val="Heading2"/>
       </w:pPr>
       <w:r>
-        <w:t>F</w:t>
-      </w:r>
-      <w:r>
-        <w:t>.1  Persiapan Sebelum Ujian</w:t>
+        <w:t>F.1  Persiapan Sebelum Ujian</w:t>
       </w:r>
     </w:p>
     <w:tbl>
@@ -4514,12 +4197,6 @@
         <w:gridCol w:w="9026"/>
       </w:tblGrid>
       <w:tr>
-        <w:tblPrEx>
-          <w:tblCellMar>
-            <w:top w:w="0" w:type="dxa"/>
-            <w:bottom w:w="0" w:type="dxa"/>
-          </w:tblCellMar>
-        </w:tblPrEx>
         <w:tc>
           <w:tcPr>
             <w:tcW w:w="9026" w:type="dxa"/>
@@ -4544,31 +4221,7 @@
                 <w:bCs/>
                 <w:color w:val="7D4E00"/>
               </w:rPr>
-              <w:t>⚠</w:t>
-            </w:r>
-            <w:r>
-              <w:rPr>
-                <w:b/>
-                <w:bCs/>
-                <w:color w:val="7D4E00"/>
-              </w:rPr>
-              <w:t>️</w:t>
-            </w:r>
-            <w:r>
-              <w:rPr>
-                <w:b/>
-                <w:bCs/>
-                <w:color w:val="7D4E00"/>
-              </w:rPr>
-              <w:t xml:space="preserve">  Wajib Diperhatikan</w:t>
-            </w:r>
-            <w:r>
-              <w:rPr>
-                <w:b/>
-                <w:bCs/>
-                <w:color w:val="7D4E00"/>
-              </w:rPr>
-              <w:t xml:space="preserve">: </w:t>
+              <w:t xml:space="preserve">⚠️  Wajib Diperhatikan: </w:t>
             </w:r>
             <w:r>
               <w:t>Pastikan semua kondisi berikut sudah terpenuhi sebelum membuka SEB.</w:t>
@@ -4726,10 +4379,7 @@
         <w:pStyle w:val="Heading2"/>
       </w:pPr>
       <w:r>
-        <w:t>F.</w:t>
-      </w:r>
-      <w:r>
-        <w:t>2  Membuka Aplikasi dan Memulai Ujian</w:t>
+        <w:t>F.2  Membuka Aplikasi dan Memulai Ujian</w:t>
       </w:r>
     </w:p>
     <w:p>
@@ -4820,10 +4470,7 @@
         <w:spacing w:before="40" w:after="40"/>
       </w:pPr>
       <w:r>
-        <w:t>Baca halaman penjelasan dan tata tertib yang ditampi</w:t>
-      </w:r>
-      <w:r>
-        <w:t>lkan dengan cermat.</w:t>
+        <w:t>Baca halaman penjelasan dan tata tertib yang ditampilkan dengan cermat.</w:t>
       </w:r>
     </w:p>
     <w:p>
@@ -4905,12 +4552,6 @@
         <w:gridCol w:w="9026"/>
       </w:tblGrid>
       <w:tr>
-        <w:tblPrEx>
-          <w:tblCellMar>
-            <w:top w:w="0" w:type="dxa"/>
-            <w:bottom w:w="0" w:type="dxa"/>
-          </w:tblCellMar>
-        </w:tblPrEx>
         <w:tc>
           <w:tcPr>
             <w:tcW w:w="9026" w:type="dxa"/>
@@ -4935,23 +4576,7 @@
                 <w:bCs/>
                 <w:color w:val="7D4E00"/>
               </w:rPr>
-              <w:t>⚠</w:t>
-            </w:r>
-            <w:r>
-              <w:rPr>
-                <w:b/>
-                <w:bCs/>
-                <w:color w:val="7D4E00"/>
-              </w:rPr>
-              <w:t>️</w:t>
-            </w:r>
-            <w:r>
-              <w:rPr>
-                <w:b/>
-                <w:bCs/>
-                <w:color w:val="7D4E00"/>
-              </w:rPr>
-              <w:t xml:space="preserve">  Perhatian: </w:t>
+              <w:t xml:space="preserve">⚠️  Perhatian: </w:t>
             </w:r>
             <w:r>
               <w:t xml:space="preserve">Selama mode </w:t>
@@ -5102,10 +4727,7 @@
         <w:spacing w:before="40" w:after="40"/>
       </w:pPr>
       <w:r>
-        <w:t>Setelah semua soal selesai dijawab, klik tombol Selesai</w:t>
-      </w:r>
-      <w:r>
-        <w:t>.</w:t>
+        <w:t>Setelah semua soal selesai dijawab, klik tombol Selesai.</w:t>
       </w:r>
     </w:p>
     <w:p>
@@ -5260,12 +4882,6 @@
         <w:gridCol w:w="9026"/>
       </w:tblGrid>
       <w:tr>
-        <w:tblPrEx>
-          <w:tblCellMar>
-            <w:top w:w="0" w:type="dxa"/>
-            <w:bottom w:w="0" w:type="dxa"/>
-          </w:tblCellMar>
-        </w:tblPrEx>
         <w:tc>
           <w:tcPr>
             <w:tcW w:w="9026" w:type="dxa"/>
@@ -5290,15 +4906,7 @@
                 <w:bCs/>
                 <w:color w:val="276221"/>
               </w:rPr>
-              <w:t>✅</w:t>
-            </w:r>
-            <w:r>
-              <w:rPr>
-                <w:b/>
-                <w:bCs/>
-                <w:color w:val="276221"/>
-              </w:rPr>
-              <w:t xml:space="preserve">  Ujian Selesai: </w:t>
+              <w:t xml:space="preserve">✅  Ujian Selesai: </w:t>
             </w:r>
             <w:r>
               <w:t>Peserta dapat menunggu instruksi selanjutnya dari pengawas.</w:t>
@@ -5364,12 +4972,6 @@
         <w:gridCol w:w="3000"/>
       </w:tblGrid>
       <w:tr>
-        <w:tblPrEx>
-          <w:tblCellMar>
-            <w:top w:w="0" w:type="dxa"/>
-            <w:bottom w:w="0" w:type="dxa"/>
-          </w:tblCellMar>
-        </w:tblPrEx>
         <w:tc>
           <w:tcPr>
             <w:tcW w:w="2500" w:type="dxa"/>
@@ -5465,12 +5067,6 @@
         </w:tc>
       </w:tr>
       <w:tr>
-        <w:tblPrEx>
-          <w:tblCellMar>
-            <w:top w:w="0" w:type="dxa"/>
-            <w:bottom w:w="0" w:type="dxa"/>
-          </w:tblCellMar>
-        </w:tblPrEx>
         <w:tc>
           <w:tcPr>
             <w:tcW w:w="2500" w:type="dxa"/>
@@ -5556,12 +5152,6 @@
         </w:tc>
       </w:tr>
       <w:tr>
-        <w:tblPrEx>
-          <w:tblCellMar>
-            <w:top w:w="0" w:type="dxa"/>
-            <w:bottom w:w="0" w:type="dxa"/>
-          </w:tblCellMar>
-        </w:tblPrEx>
         <w:tc>
           <w:tcPr>
             <w:tcW w:w="2500" w:type="dxa"/>
@@ -5723,12 +5313,6 @@
         </w:tc>
       </w:tr>
       <w:tr>
-        <w:tblPrEx>
-          <w:tblCellMar>
-            <w:top w:w="0" w:type="dxa"/>
-            <w:bottom w:w="0" w:type="dxa"/>
-          </w:tblCellMar>
-        </w:tblPrEx>
         <w:tc>
           <w:tcPr>
             <w:tcW w:w="2500" w:type="dxa"/>
@@ -5846,12 +5430,6 @@
         </w:tc>
       </w:tr>
       <w:tr>
-        <w:tblPrEx>
-          <w:tblCellMar>
-            <w:top w:w="0" w:type="dxa"/>
-            <w:bottom w:w="0" w:type="dxa"/>
-          </w:tblCellMar>
-        </w:tblPrEx>
         <w:tc>
           <w:tcPr>
             <w:tcW w:w="2500" w:type="dxa"/>
@@ -5953,12 +5531,6 @@
         </w:tc>
       </w:tr>
       <w:tr>
-        <w:tblPrEx>
-          <w:tblCellMar>
-            <w:top w:w="0" w:type="dxa"/>
-            <w:bottom w:w="0" w:type="dxa"/>
-          </w:tblCellMar>
-        </w:tblPrEx>
         <w:tc>
           <w:tcPr>
             <w:tcW w:w="2500" w:type="dxa"/>
@@ -6098,12 +5670,6 @@
         <w:gridCol w:w="9026"/>
       </w:tblGrid>
       <w:tr>
-        <w:tblPrEx>
-          <w:tblCellMar>
-            <w:top w:w="0" w:type="dxa"/>
-            <w:bottom w:w="0" w:type="dxa"/>
-          </w:tblCellMar>
-        </w:tblPrEx>
         <w:tc>
           <w:tcPr>
             <w:tcW w:w="9026" w:type="dxa"/>
@@ -6123,10 +5689,7 @@
           </w:tcPr>
           <w:p>
             <w:r>
-              <w:t>❓</w:t>
-            </w:r>
-            <w:r>
-              <w:t xml:space="preserve">  </w:t>
+              <w:t xml:space="preserve">❓  </w:t>
             </w:r>
             <w:r>
               <w:rPr>
@@ -6140,12 +5703,6 @@
         </w:tc>
       </w:tr>
       <w:tr>
-        <w:tblPrEx>
-          <w:tblCellMar>
-            <w:top w:w="0" w:type="dxa"/>
-            <w:bottom w:w="0" w:type="dxa"/>
-          </w:tblCellMar>
-        </w:tblPrEx>
         <w:tc>
           <w:tcPr>
             <w:tcW w:w="9026" w:type="dxa"/>
@@ -6221,12 +5778,6 @@
         <w:gridCol w:w="9026"/>
       </w:tblGrid>
       <w:tr>
-        <w:tblPrEx>
-          <w:tblCellMar>
-            <w:top w:w="0" w:type="dxa"/>
-            <w:bottom w:w="0" w:type="dxa"/>
-          </w:tblCellMar>
-        </w:tblPrEx>
         <w:tc>
           <w:tcPr>
             <w:tcW w:w="9026" w:type="dxa"/>
@@ -6247,10 +5798,7 @@
           <w:p>
             <w:r>
               <w:lastRenderedPageBreak/>
-              <w:t>❓</w:t>
-            </w:r>
-            <w:r>
-              <w:t xml:space="preserve">  </w:t>
+              <w:t xml:space="preserve">❓  </w:t>
             </w:r>
             <w:r>
               <w:rPr>
@@ -6282,12 +5830,6 @@
         </w:tc>
       </w:tr>
       <w:tr>
-        <w:tblPrEx>
-          <w:tblCellMar>
-            <w:top w:w="0" w:type="dxa"/>
-            <w:bottom w:w="0" w:type="dxa"/>
-          </w:tblCellMar>
-        </w:tblPrEx>
         <w:tc>
           <w:tcPr>
             <w:tcW w:w="9026" w:type="dxa"/>
@@ -6371,12 +5913,6 @@
         <w:gridCol w:w="9026"/>
       </w:tblGrid>
       <w:tr>
-        <w:tblPrEx>
-          <w:tblCellMar>
-            <w:top w:w="0" w:type="dxa"/>
-            <w:bottom w:w="0" w:type="dxa"/>
-          </w:tblCellMar>
-        </w:tblPrEx>
         <w:tc>
           <w:tcPr>
             <w:tcW w:w="9026" w:type="dxa"/>
@@ -6396,10 +5932,7 @@
           </w:tcPr>
           <w:p>
             <w:r>
-              <w:t>❓</w:t>
-            </w:r>
-            <w:r>
-              <w:t xml:space="preserve">  </w:t>
+              <w:t xml:space="preserve">❓  </w:t>
             </w:r>
             <w:proofErr w:type="spellStart"/>
             <w:r>
@@ -6423,12 +5956,6 @@
         </w:tc>
       </w:tr>
       <w:tr>
-        <w:tblPrEx>
-          <w:tblCellMar>
-            <w:top w:w="0" w:type="dxa"/>
-            <w:bottom w:w="0" w:type="dxa"/>
-          </w:tblCellMar>
-        </w:tblPrEx>
         <w:tc>
           <w:tcPr>
             <w:tcW w:w="9026" w:type="dxa"/>
@@ -6448,10 +5975,7 @@
           </w:tcPr>
           <w:p>
             <w:r>
-              <w:t>Ini normal — beberapa antivirus salah mendeteksi SEB karena SEB mengontrol sist</w:t>
-            </w:r>
-            <w:r>
-              <w:t xml:space="preserve">em secara mendalam. Nonaktifkan antivirus sementara saat </w:t>
+              <w:t xml:space="preserve">Ini normal — beberapa antivirus salah mendeteksi SEB karena SEB mengontrol sistem secara mendalam. Nonaktifkan antivirus sementara saat </w:t>
             </w:r>
             <w:proofErr w:type="spellStart"/>
             <w:r>
@@ -6515,12 +6039,6 @@
         <w:gridCol w:w="9026"/>
       </w:tblGrid>
       <w:tr>
-        <w:tblPrEx>
-          <w:tblCellMar>
-            <w:top w:w="0" w:type="dxa"/>
-            <w:bottom w:w="0" w:type="dxa"/>
-          </w:tblCellMar>
-        </w:tblPrEx>
         <w:tc>
           <w:tcPr>
             <w:tcW w:w="9026" w:type="dxa"/>
@@ -6540,10 +6058,7 @@
           </w:tcPr>
           <w:p>
             <w:r>
-              <w:t>❓</w:t>
-            </w:r>
-            <w:r>
-              <w:t xml:space="preserve">  </w:t>
+              <w:t xml:space="preserve">❓  </w:t>
             </w:r>
             <w:r>
               <w:rPr>
@@ -6557,12 +6072,6 @@
         </w:tc>
       </w:tr>
       <w:tr>
-        <w:tblPrEx>
-          <w:tblCellMar>
-            <w:top w:w="0" w:type="dxa"/>
-            <w:bottom w:w="0" w:type="dxa"/>
-          </w:tblCellMar>
-        </w:tblPrEx>
         <w:tc>
           <w:tcPr>
             <w:tcW w:w="9026" w:type="dxa"/>
@@ -6614,12 +6123,6 @@
         <w:gridCol w:w="9026"/>
       </w:tblGrid>
       <w:tr>
-        <w:tblPrEx>
-          <w:tblCellMar>
-            <w:top w:w="0" w:type="dxa"/>
-            <w:bottom w:w="0" w:type="dxa"/>
-          </w:tblCellMar>
-        </w:tblPrEx>
         <w:tc>
           <w:tcPr>
             <w:tcW w:w="9026" w:type="dxa"/>
@@ -6639,10 +6142,7 @@
           </w:tcPr>
           <w:p>
             <w:r>
-              <w:t>❓</w:t>
-            </w:r>
-            <w:r>
-              <w:t xml:space="preserve">  </w:t>
+              <w:t xml:space="preserve">❓  </w:t>
             </w:r>
             <w:r>
               <w:rPr>
@@ -6674,12 +6174,6 @@
         </w:tc>
       </w:tr>
       <w:tr>
-        <w:tblPrEx>
-          <w:tblCellMar>
-            <w:top w:w="0" w:type="dxa"/>
-            <w:bottom w:w="0" w:type="dxa"/>
-          </w:tblCellMar>
-        </w:tblPrEx>
         <w:tc>
           <w:tcPr>
             <w:tcW w:w="9026" w:type="dxa"/>
@@ -6731,12 +6225,6 @@
         <w:gridCol w:w="9026"/>
       </w:tblGrid>
       <w:tr>
-        <w:tblPrEx>
-          <w:tblCellMar>
-            <w:top w:w="0" w:type="dxa"/>
-            <w:bottom w:w="0" w:type="dxa"/>
-          </w:tblCellMar>
-        </w:tblPrEx>
         <w:tc>
           <w:tcPr>
             <w:tcW w:w="9026" w:type="dxa"/>
@@ -6756,10 +6244,7 @@
           </w:tcPr>
           <w:p>
             <w:r>
-              <w:t>❓</w:t>
-            </w:r>
-            <w:r>
-              <w:t xml:space="preserve">  </w:t>
+              <w:t xml:space="preserve">❓  </w:t>
             </w:r>
             <w:r>
               <w:rPr>
@@ -6773,12 +6258,6 @@
         </w:tc>
       </w:tr>
       <w:tr>
-        <w:tblPrEx>
-          <w:tblCellMar>
-            <w:top w:w="0" w:type="dxa"/>
-            <w:bottom w:w="0" w:type="dxa"/>
-          </w:tblCellMar>
-        </w:tblPrEx>
         <w:tc>
           <w:tcPr>
             <w:tcW w:w="9026" w:type="dxa"/>
@@ -6838,12 +6317,6 @@
         <w:gridCol w:w="9026"/>
       </w:tblGrid>
       <w:tr>
-        <w:tblPrEx>
-          <w:tblCellMar>
-            <w:top w:w="0" w:type="dxa"/>
-            <w:bottom w:w="0" w:type="dxa"/>
-          </w:tblCellMar>
-        </w:tblPrEx>
         <w:tc>
           <w:tcPr>
             <w:tcW w:w="9026" w:type="dxa"/>
@@ -6863,10 +6336,7 @@
           </w:tcPr>
           <w:p>
             <w:r>
-              <w:t>❓</w:t>
-            </w:r>
-            <w:r>
-              <w:t xml:space="preserve">  </w:t>
+              <w:t xml:space="preserve">❓  </w:t>
             </w:r>
             <w:r>
               <w:rPr>
@@ -6892,26 +6362,12 @@
                 <w:bCs/>
                 <w:color w:val="1F4E79"/>
               </w:rPr>
-              <w:t xml:space="preserve"> SEB, apa yang harus</w:t>
-            </w:r>
-            <w:r>
-              <w:rPr>
-                <w:b/>
-                <w:bCs/>
-                <w:color w:val="1F4E79"/>
-              </w:rPr>
-              <w:t xml:space="preserve"> dilakukan?</w:t>
+              <w:t xml:space="preserve"> SEB, apa yang harus dilakukan?</w:t>
             </w:r>
           </w:p>
         </w:tc>
       </w:tr>
       <w:tr>
-        <w:tblPrEx>
-          <w:tblCellMar>
-            <w:top w:w="0" w:type="dxa"/>
-            <w:bottom w:w="0" w:type="dxa"/>
-          </w:tblCellMar>
-        </w:tblPrEx>
         <w:tc>
           <w:tcPr>
             <w:tcW w:w="9026" w:type="dxa"/>
@@ -6963,12 +6419,6 @@
         <w:gridCol w:w="9026"/>
       </w:tblGrid>
       <w:tr>
-        <w:tblPrEx>
-          <w:tblCellMar>
-            <w:top w:w="0" w:type="dxa"/>
-            <w:bottom w:w="0" w:type="dxa"/>
-          </w:tblCellMar>
-        </w:tblPrEx>
         <w:tc>
           <w:tcPr>
             <w:tcW w:w="9026" w:type="dxa"/>
@@ -6988,10 +6438,7 @@
           </w:tcPr>
           <w:p>
             <w:r>
-              <w:t>❓</w:t>
-            </w:r>
-            <w:r>
-              <w:t xml:space="preserve">  </w:t>
+              <w:t xml:space="preserve">❓  </w:t>
             </w:r>
             <w:r>
               <w:rPr>
@@ -7005,12 +6452,6 @@
         </w:tc>
       </w:tr>
       <w:tr>
-        <w:tblPrEx>
-          <w:tblCellMar>
-            <w:top w:w="0" w:type="dxa"/>
-            <w:bottom w:w="0" w:type="dxa"/>
-          </w:tblCellMar>
-        </w:tblPrEx>
         <w:tc>
           <w:tcPr>
             <w:tcW w:w="9026" w:type="dxa"/>
@@ -7062,12 +6503,6 @@
         <w:gridCol w:w="9026"/>
       </w:tblGrid>
       <w:tr>
-        <w:tblPrEx>
-          <w:tblCellMar>
-            <w:top w:w="0" w:type="dxa"/>
-            <w:bottom w:w="0" w:type="dxa"/>
-          </w:tblCellMar>
-        </w:tblPrEx>
         <w:tc>
           <w:tcPr>
             <w:tcW w:w="9026" w:type="dxa"/>
@@ -7087,10 +6522,7 @@
           </w:tcPr>
           <w:p>
             <w:r>
-              <w:t>❓</w:t>
-            </w:r>
-            <w:r>
-              <w:t xml:space="preserve">  </w:t>
+              <w:t xml:space="preserve">❓  </w:t>
             </w:r>
             <w:proofErr w:type="spellStart"/>
             <w:r>
@@ -7132,12 +6564,6 @@
         </w:tc>
       </w:tr>
       <w:tr>
-        <w:tblPrEx>
-          <w:tblCellMar>
-            <w:top w:w="0" w:type="dxa"/>
-            <w:bottom w:w="0" w:type="dxa"/>
-          </w:tblCellMar>
-        </w:tblPrEx>
         <w:tc>
           <w:tcPr>
             <w:tcW w:w="9026" w:type="dxa"/>
@@ -7193,10 +6619,7 @@
             </w:r>
             <w:proofErr w:type="spellStart"/>
             <w:r>
-              <w:t>Saf</w:t>
-            </w:r>
-            <w:r>
-              <w:t>eExamBrowser</w:t>
+              <w:t>SafeExamBrowser</w:t>
             </w:r>
             <w:proofErr w:type="spellEnd"/>
             <w:r>
@@ -7209,7 +6632,23 @@
                   <w:b/>
                   <w:bCs/>
                 </w:rPr>
-                <w:t>s.id/olympiad2026</w:t>
+                <w:t>s.id/olympiad</w:t>
+              </w:r>
+              <w:r>
+                <w:rPr>
+                  <w:rStyle w:val="Hyperlink"/>
+                  <w:b/>
+                  <w:bCs/>
+                </w:rPr>
+                <w:t>-</w:t>
+              </w:r>
+              <w:r>
+                <w:rPr>
+                  <w:rStyle w:val="Hyperlink"/>
+                  <w:b/>
+                  <w:bCs/>
+                </w:rPr>
+                <w:t>2026</w:t>
               </w:r>
             </w:hyperlink>
             <w:r>
@@ -7245,12 +6684,6 @@
         <w:gridCol w:w="9026"/>
       </w:tblGrid>
       <w:tr>
-        <w:tblPrEx>
-          <w:tblCellMar>
-            <w:top w:w="0" w:type="dxa"/>
-            <w:bottom w:w="0" w:type="dxa"/>
-          </w:tblCellMar>
-        </w:tblPrEx>
         <w:tc>
           <w:tcPr>
             <w:tcW w:w="9026" w:type="dxa"/>
@@ -7270,10 +6703,7 @@
           </w:tcPr>
           <w:p>
             <w:r>
-              <w:t>❓</w:t>
-            </w:r>
-            <w:r>
-              <w:t xml:space="preserve">  </w:t>
+              <w:t xml:space="preserve">❓  </w:t>
             </w:r>
             <w:r>
               <w:rPr>
@@ -7287,12 +6717,6 @@
         </w:tc>
       </w:tr>
       <w:tr>
-        <w:tblPrEx>
-          <w:tblCellMar>
-            <w:top w:w="0" w:type="dxa"/>
-            <w:bottom w:w="0" w:type="dxa"/>
-          </w:tblCellMar>
-        </w:tblPrEx>
         <w:tc>
           <w:tcPr>
             <w:tcW w:w="9026" w:type="dxa"/>
@@ -7420,12 +6844,6 @@
         <w:gridCol w:w="9026"/>
       </w:tblGrid>
       <w:tr>
-        <w:tblPrEx>
-          <w:tblCellMar>
-            <w:top w:w="0" w:type="dxa"/>
-            <w:bottom w:w="0" w:type="dxa"/>
-          </w:tblCellMar>
-        </w:tblPrEx>
         <w:tc>
           <w:tcPr>
             <w:tcW w:w="9026" w:type="dxa"/>
@@ -7453,23 +6871,7 @@
                 <w:bCs/>
                 <w:color w:val="1F4E79"/>
               </w:rPr>
-              <w:t>ℹ</w:t>
-            </w:r>
-            <w:r>
-              <w:rPr>
-                <w:b/>
-                <w:bCs/>
-                <w:color w:val="1F4E79"/>
-              </w:rPr>
-              <w:t>️</w:t>
-            </w:r>
-            <w:r>
-              <w:rPr>
-                <w:b/>
-                <w:bCs/>
-                <w:color w:val="1F4E79"/>
-              </w:rPr>
-              <w:t xml:space="preserve">  Info Penting: </w:t>
+              <w:t xml:space="preserve">ℹ️  Info Penting: </w:t>
             </w:r>
           </w:p>
           <w:p>
@@ -7477,10 +6879,7 @@
               <w:spacing w:after="40"/>
             </w:pPr>
             <w:r>
-              <w:t xml:space="preserve">• Simpan dokumen ini di perangkat kamu agar bisa dibaca </w:t>
-            </w:r>
-            <w:r>
-              <w:t>kapan saja, termasuk saat tidak ada koneksi internet.</w:t>
+              <w:t>• Simpan dokumen ini di perangkat kamu agar bisa dibaca kapan saja, termasuk saat tidak ada koneksi internet.</w:t>
             </w:r>
           </w:p>
           <w:p>
@@ -7582,15 +6981,7 @@
         <w:sz w:val="18"/>
         <w:szCs w:val="18"/>
       </w:rPr>
-      <w:t>|</w:t>
-    </w:r>
-    <w:r>
-      <w:rPr>
-        <w:color w:val="888888"/>
-        <w:sz w:val="18"/>
-        <w:szCs w:val="18"/>
-      </w:rPr>
-      <w:t xml:space="preserve"> </w:t>
+      <w:t xml:space="preserve">| </w:t>
     </w:r>
     <w:r>
       <w:rPr>
@@ -8848,6 +8239,7 @@
   <w:style w:type="character" w:default="1" w:styleId="DefaultParagraphFont">
     <w:name w:val="Default Paragraph Font"/>
     <w:uiPriority w:val="1"/>
+    <w:semiHidden/>
     <w:unhideWhenUsed/>
   </w:style>
   <w:style w:type="table" w:default="1" w:styleId="TableNormal">

</xml_diff>